<commit_message>
Auto commit (2026-10-22 15:27) — 4 changes
Claude Code 세션 종료 시 자동 커밋.

Co-Authored-By: Claude <noreply@anthropic.com>
Claude-Session: https://claude.ai/code/c0a89216-3ffc-4811-bb74-40a52d07d246
</commit_message>
<xml_diff>
--- a/projects/39_baby_dragon/The Vampire King's Human Nanny_작가 proposal.docx
+++ b/projects/39_baby_dragon/The Vampire King's Human Nanny_작가 proposal.docx
@@ -297,7 +297,7 @@
           <w:b w:val="0"/>
           <w:sz w:val="20"/>
         </w:rPr>
-        <w:t>· 톤 = 판은 진지(목숨·처형 위협)한데 코미디가 짙은 것. 마피아판 참고</w:t>
+        <w:t>· 톤 = 상황은 심각한데(목숨·처형 위협) 코미디가 짙은 것. 서브 레퍼런스(마피아 리메이크) 참고</w:t>
       </w:r>
     </w:p>
     <w:p>
@@ -310,7 +310,7 @@
           <w:b w:val="0"/>
           <w:sz w:val="20"/>
         </w:rPr>
-        <w:t>· 남주에게도 끌리고, 아기가 귀여워서도 끌리는 두 축</w:t>
+        <w:t>· 남주에게도 끌리고, 아기가 귀여워서도 끌리는 작품</w:t>
       </w:r>
     </w:p>
     <w:p>
@@ -323,7 +323,7 @@
           <w:b w:val="0"/>
           <w:sz w:val="20"/>
         </w:rPr>
-        <w:t>· 50화 로맨스 뼈대 = 줄리안의 죽은 왕비가 다른 세계에서 노라로 환생(세계마다 시간이 다르게 흐름). 설명보다 힌트로</w:t>
+        <w:t>· 유료 로맨스 = 줄리안의 죽은 왕비가 다른 세계에서 노라로 환생(두 세계는 시간이 다르게 흐름). 설명은 최소, 힌트로 깔다가 후반에 밝힘</w:t>
       </w:r>
     </w:p>
     <w:p>

</xml_diff>